<commit_message>
feat: upgrade master resume — federal procurement vehicles + named AI builds + Quadratic context
Enhanced summary_full to be the genuine master document:
- Adds GSA MAS Schedule, STARS III, 8(a)/SDVOSB/HUBZone, IDIQ/BPA,
  FedRAMP, ATO, PA ITQ procurement-vehicle fluency
- Names current Chief Growth Officer at Quadratic Digital (14-person)
- Names both AI builds with their headline metrics inline
  (RFP Factory: 40h to 2h, 20x faster; Futures Bot: 62% over 500+ trades)
- Sharpened target-roles closer

Site picker relabels Universal Full as 'Master resume (~3-4 pages)'
with description: 'This is the one to send.' Brief stays for ATS.

Co-Authored-By: Claude Opus 4.7 (1M context) <noreply@anthropic.com>
</commit_message>
<xml_diff>
--- a/public/resumes/Jordan-Henning-Resume.docx
+++ b/public/resumes/Jordan-Henning-Resume.docx
@@ -290,7 +290,7 @@
           <w:color w:val="1A1F2C"/>
           <w:sz w:val="22"/>
         </w:rPr>
-        <w:t xml:space="preserve"> held throughout SSA tenure (2008–2025), eligible to reinstate. FAC-P/PM certified. That federal track record is now layered with hands-on multi-agent AI fluency, proven in </w:t>
+        <w:t xml:space="preserve"> held throughout SSA tenure (2008–2025), eligible to reinstate. </w:t>
       </w:r>
       <w:r>
         <w:rPr>
@@ -300,7 +300,7 @@
           <w:color w:val="1A1F2C"/>
           <w:sz w:val="22"/>
         </w:rPr>
-        <w:t>two production systems</w:t>
+        <w:t>FAC-P/PM certified</w:t>
       </w:r>
       <w:r>
         <w:rPr>
@@ -310,7 +310,67 @@
           <w:color w:val="1A1F2C"/>
           <w:sz w:val="22"/>
         </w:rPr>
-        <w:t xml:space="preserve"> I designed, coded, and operate myself. Combat-tested under three tours with the 101st Airborne (Bronze Star, Purple Heart). Targeting </w:t>
+        <w:t xml:space="preserve">; familiar with GSA MAS Schedule, STARS III, 8(a)/SDVOSB/HUBZone, IDIQ/BPA, FedRAMP, ATO governance, and PA Invitation-to-Qualify procurement. Now </w:t>
+      </w:r>
+      <w:r>
+        <w:rPr>
+          <w:rFonts w:ascii="Calibri" w:hAnsi="Calibri" w:cs="Calibri" w:eastAsia="Calibri"/>
+          <w:b/>
+          <w:i w:val="0"/>
+          <w:color w:val="1A1F2C"/>
+          <w:sz w:val="22"/>
+        </w:rPr>
+        <w:t>Chief Growth Officer at Quadratic Digital</w:t>
+      </w:r>
+      <w:r>
+        <w:rPr>
+          <w:rFonts w:ascii="Calibri" w:hAnsi="Calibri" w:cs="Calibri" w:eastAsia="Calibri"/>
+          <w:b w:val="0"/>
+          <w:i w:val="0"/>
+          <w:color w:val="1A1F2C"/>
+          <w:sz w:val="22"/>
+        </w:rPr>
+        <w:t xml:space="preserve"> (14-person federal services firm), where I personally designed, coded, and operate two production multi-agent AI systems: </w:t>
+      </w:r>
+      <w:r>
+        <w:rPr>
+          <w:rFonts w:ascii="Calibri" w:hAnsi="Calibri" w:cs="Calibri" w:eastAsia="Calibri"/>
+          <w:b/>
+          <w:i w:val="0"/>
+          <w:color w:val="1A1F2C"/>
+          <w:sz w:val="22"/>
+        </w:rPr>
+        <w:t>RFP Factory</w:t>
+      </w:r>
+      <w:r>
+        <w:rPr>
+          <w:rFonts w:ascii="Calibri" w:hAnsi="Calibri" w:cs="Calibri" w:eastAsia="Calibri"/>
+          <w:b w:val="0"/>
+          <w:i w:val="0"/>
+          <w:color w:val="1A1F2C"/>
+          <w:sz w:val="22"/>
+        </w:rPr>
+        <w:t xml:space="preserve"> (multi-agent proposal automation, 40-hour federal proposal cycles compressed to 2 hours — 20× faster) and </w:t>
+      </w:r>
+      <w:r>
+        <w:rPr>
+          <w:rFonts w:ascii="Calibri" w:hAnsi="Calibri" w:cs="Calibri" w:eastAsia="Calibri"/>
+          <w:b/>
+          <w:i w:val="0"/>
+          <w:color w:val="1A1F2C"/>
+          <w:sz w:val="22"/>
+        </w:rPr>
+        <w:t>Futures Bot</w:t>
+      </w:r>
+      <w:r>
+        <w:rPr>
+          <w:rFonts w:ascii="Calibri" w:hAnsi="Calibri" w:cs="Calibri" w:eastAsia="Calibri"/>
+          <w:b w:val="0"/>
+          <w:i w:val="0"/>
+          <w:color w:val="1A1F2C"/>
+          <w:sz w:val="22"/>
+        </w:rPr>
+        <w:t xml:space="preserve"> (autonomous multi-agent trading, live since Feb 2026, 62% win rate over 500+ trades). Combat-tested under three tours with the 101st Airborne (Bronze Star, Purple Heart). Targeting </w:t>
       </w:r>
       <w:r>
         <w:rPr>
@@ -330,7 +390,7 @@
           <w:color w:val="1A1F2C"/>
           <w:sz w:val="22"/>
         </w:rPr>
-        <w:t xml:space="preserve"> — where 99.9% uptime, $200M+ portfolio scale, and hands-on AI capability all matter in the same role.</w:t>
+        <w:t xml:space="preserve"> — where federal-scale uptime, $200M+ portfolio discipline, procurement fluency, and hands-on AI capability all matter in the same role.</w:t>
       </w:r>
     </w:p>
     <w:p>

</xml_diff>

<commit_message>
Update references availability copy
</commit_message>
<xml_diff>
--- a/public/resumes/Jordan-Henning-Resume.docx
+++ b/public/resumes/Jordan-Henning-Resume.docx
@@ -2686,7 +2686,7 @@
           <w:color w:val="1A1F2C"/>
           <w:sz w:val="22"/>
         </w:rPr>
-        <w:t>2 Federal CIO / Director-level references</w:t>
+        <w:t>1 Director-level reference</w:t>
       </w:r>
     </w:p>
     <w:p>
@@ -2712,7 +2712,7 @@
           <w:color w:val="1A1F2C"/>
           <w:sz w:val="22"/>
         </w:rPr>
-        <w:t>2 SSA peer Branch Chief references</w:t>
+        <w:t>3 SSA peer Branch Chief references</w:t>
       </w:r>
     </w:p>
     <w:p>

</xml_diff>

<commit_message>
Use references upon request wording
</commit_message>
<xml_diff>
--- a/public/resumes/Jordan-Henning-Resume.docx
+++ b/public/resumes/Jordan-Henning-Resume.docx
@@ -2660,100 +2660,7 @@
           <w:color w:val="556077"/>
           <w:sz w:val="22"/>
         </w:rPr>
-        <w:t>Available after first conversation</w:t>
-      </w:r>
-    </w:p>
-    <w:p>
-      <w:pPr>
-        <w:spacing w:before="0" w:after="80" w:line="276" w:lineRule="auto"/>
-      </w:pPr>
-      <w:r>
-        <w:rPr>
-          <w:rFonts w:ascii="Calibri" w:hAnsi="Calibri" w:cs="Calibri" w:eastAsia="Calibri"/>
-          <w:b w:val="0"/>
-          <w:i/>
-          <w:color w:val="556077"/>
-          <w:sz w:val="22"/>
-        </w:rPr>
-        <w:t>References provided after first conversation, per professional courtesy.</w:t>
-      </w:r>
-    </w:p>
-    <w:p>
-      <w:pPr>
-        <w:spacing w:before="0" w:after="60" w:line="276" w:lineRule="auto"/>
-        <w:ind w:left="360" w:hanging="259"/>
-      </w:pPr>
-      <w:r>
-        <w:rPr>
-          <w:rFonts w:ascii="Calibri" w:hAnsi="Calibri" w:cs="Calibri" w:eastAsia="Calibri"/>
-          <w:b/>
-          <w:i w:val="0"/>
-          <w:color w:val="1F4E8C"/>
-          <w:sz w:val="22"/>
-        </w:rPr>
-        <w:t xml:space="preserve">•  </w:t>
-      </w:r>
-      <w:r>
-        <w:rPr>
-          <w:rFonts w:ascii="Calibri" w:hAnsi="Calibri" w:cs="Calibri" w:eastAsia="Calibri"/>
-          <w:b w:val="0"/>
-          <w:i w:val="0"/>
-          <w:color w:val="1A1F2C"/>
-          <w:sz w:val="22"/>
-        </w:rPr>
-        <w:t>1 Director-level reference</w:t>
-      </w:r>
-    </w:p>
-    <w:p>
-      <w:pPr>
-        <w:spacing w:before="0" w:after="60" w:line="276" w:lineRule="auto"/>
-        <w:ind w:left="360" w:hanging="259"/>
-      </w:pPr>
-      <w:r>
-        <w:rPr>
-          <w:rFonts w:ascii="Calibri" w:hAnsi="Calibri" w:cs="Calibri" w:eastAsia="Calibri"/>
-          <w:b/>
-          <w:i w:val="0"/>
-          <w:color w:val="1F4E8C"/>
-          <w:sz w:val="22"/>
-        </w:rPr>
-        <w:t xml:space="preserve">•  </w:t>
-      </w:r>
-      <w:r>
-        <w:rPr>
-          <w:rFonts w:ascii="Calibri" w:hAnsi="Calibri" w:cs="Calibri" w:eastAsia="Calibri"/>
-          <w:b w:val="0"/>
-          <w:i w:val="0"/>
-          <w:color w:val="1A1F2C"/>
-          <w:sz w:val="22"/>
-        </w:rPr>
-        <w:t>3 SSA peer Branch Chiefs</w:t>
-      </w:r>
-    </w:p>
-    <w:p>
-      <w:pPr>
-        <w:spacing w:before="0" w:after="60" w:line="276" w:lineRule="auto"/>
-        <w:ind w:left="360" w:hanging="259"/>
-      </w:pPr>
-      <w:r>
-        <w:rPr>
-          <w:rFonts w:ascii="Calibri" w:hAnsi="Calibri" w:cs="Calibri" w:eastAsia="Calibri"/>
-          <w:b/>
-          <w:i w:val="0"/>
-          <w:color w:val="1F4E8C"/>
-          <w:sz w:val="22"/>
-        </w:rPr>
-        <w:t xml:space="preserve">•  </w:t>
-      </w:r>
-      <w:r>
-        <w:rPr>
-          <w:rFonts w:ascii="Calibri" w:hAnsi="Calibri" w:cs="Calibri" w:eastAsia="Calibri"/>
-          <w:b w:val="0"/>
-          <w:i w:val="0"/>
-          <w:color w:val="1A1F2C"/>
-          <w:sz w:val="22"/>
-        </w:rPr>
-        <w:t>Multiple direct reports across SSA + Quadratic Digital</w:t>
+        <w:t>References available upon request</w:t>
       </w:r>
     </w:p>
     <w:p>

</xml_diff>